<commit_message>
added dictionaries and updated the README data folder
</commit_message>
<xml_diff>
--- a/README data/README_ Dataset Overview and File Descriptions.docx
+++ b/README data/README_ Dataset Overview and File Descriptions.docx
@@ -7,7 +7,22 @@
         <w:ind w:left="-284"/>
       </w:pPr>
       <w:r>
-        <w:t>This repository contains motion sensor data and related documentation collected from three primary sources:</w:t>
+        <w:t>This repository contains motion sensor data and related documentation collected from</w:t>
+      </w:r>
+      <w:r>
+        <w:br/>
+      </w:r>
+      <w:r>
+        <w:rPr>
+          <w:b/>
+        </w:rPr>
+        <w:t>ORCATECH Dataset</w:t>
+      </w:r>
+      <w:r>
+        <w:rPr>
+          <w:b/>
+        </w:rPr>
+        <w:t>:</w:t>
       </w:r>
     </w:p>
     <w:p>
@@ -17,224 +32,8 @@
           <w:numId w:val="1"/>
         </w:numPr>
         <w:ind w:left="142"/>
-        <w:rPr>
-          <w:b/>
-        </w:rPr>
-      </w:pPr>
-      <w:r>
-        <w:rPr>
-          <w:b/>
-        </w:rPr>
-        <w:t>Sofihub Dataset</w:t>
-      </w:r>
-    </w:p>
-    <w:p>
-      <w:pPr>
-        <w:numPr>
-          <w:ilvl w:val="1"/>
-          <w:numId w:val="1"/>
-        </w:numPr>
-        <w:ind w:left="567"/>
       </w:pPr>
       <w:hyperlink r:id="rId7">
-        <w:r>
-          <w:rPr>
-            <w:color w:val="1155CC"/>
-            <w:u w:val="single"/>
-          </w:rPr>
-          <w:t>https://www.sofihub.com/</w:t>
-        </w:r>
-      </w:hyperlink>
-    </w:p>
-    <w:p>
-      <w:pPr>
-        <w:numPr>
-          <w:ilvl w:val="1"/>
-          <w:numId w:val="1"/>
-        </w:numPr>
-        <w:ind w:left="567"/>
-      </w:pPr>
-      <w:r>
-        <w:t>This dataset includes motion sensor data &amp; house maps collected from their users (</w:t>
-      </w:r>
-      <w:r>
-        <w:rPr>
-          <w:rFonts w:ascii="Roboto Mono" w:eastAsia="Roboto Mono" w:hAnsi="Roboto Mono" w:cs="Roboto Mono"/>
-          <w:b/>
-          <w:color w:val="188038"/>
-        </w:rPr>
-        <w:t>Sofihub info</w:t>
-      </w:r>
-      <w:r>
-        <w:rPr>
-          <w:rFonts w:ascii="Roboto Mono" w:eastAsia="Roboto Mono" w:hAnsi="Roboto Mono" w:cs="Roboto Mono"/>
-        </w:rPr>
-        <w:t>)</w:t>
-      </w:r>
-      <w:r>
-        <w:t xml:space="preserve"> &amp; Ingrid (</w:t>
-      </w:r>
-      <w:r>
-        <w:rPr>
-          <w:rFonts w:ascii="Roboto Mono" w:eastAsia="Roboto Mono" w:hAnsi="Roboto Mono" w:cs="Roboto Mono"/>
-          <w:b/>
-          <w:color w:val="188038"/>
-        </w:rPr>
-        <w:t>Test_Ingrid</w:t>
-      </w:r>
-      <w:r>
-        <w:t>).</w:t>
-      </w:r>
-    </w:p>
-    <w:p>
-      <w:pPr>
-        <w:numPr>
-          <w:ilvl w:val="1"/>
-          <w:numId w:val="1"/>
-        </w:numPr>
-        <w:ind w:left="567"/>
-      </w:pPr>
-      <w:r>
-        <w:t>Meeting summaries with Sofihub:</w:t>
-      </w:r>
-      <w:r>
-        <w:rPr>
-          <w:rFonts w:ascii="Roboto Mono" w:eastAsia="Roboto Mono" w:hAnsi="Roboto Mono" w:cs="Roboto Mono"/>
-          <w:b/>
-          <w:color w:val="188038"/>
-        </w:rPr>
-        <w:t xml:space="preserve"> </w:t>
-      </w:r>
-    </w:p>
-    <w:p>
-      <w:pPr>
-        <w:numPr>
-          <w:ilvl w:val="2"/>
-          <w:numId w:val="1"/>
-        </w:numPr>
-        <w:ind w:left="1134"/>
-      </w:pPr>
-      <w:r>
-        <w:rPr>
-          <w:rFonts w:ascii="Roboto Mono" w:eastAsia="Roboto Mono" w:hAnsi="Roboto Mono" w:cs="Roboto Mono"/>
-          <w:b/>
-          <w:color w:val="188038"/>
-        </w:rPr>
-        <w:t>Meeting-Sofihub.docx</w:t>
-      </w:r>
-      <w:r>
-        <w:t xml:space="preserve"> and</w:t>
-      </w:r>
-      <w:r>
-        <w:rPr>
-          <w:rFonts w:ascii="Roboto Mono" w:eastAsia="Roboto Mono" w:hAnsi="Roboto Mono" w:cs="Roboto Mono"/>
-          <w:b/>
-          <w:color w:val="188038"/>
-        </w:rPr>
-        <w:t xml:space="preserve"> </w:t>
-      </w:r>
-    </w:p>
-    <w:p>
-      <w:pPr>
-        <w:numPr>
-          <w:ilvl w:val="2"/>
-          <w:numId w:val="1"/>
-        </w:numPr>
-        <w:ind w:left="1134"/>
-      </w:pPr>
-      <w:r>
-        <w:rPr>
-          <w:rFonts w:ascii="Roboto Mono" w:eastAsia="Roboto Mono" w:hAnsi="Roboto Mono" w:cs="Roboto Mono"/>
-          <w:b/>
-          <w:color w:val="188038"/>
-        </w:rPr>
-        <w:t>Senser data reading.docx</w:t>
-      </w:r>
-    </w:p>
-    <w:p>
-      <w:pPr>
-        <w:numPr>
-          <w:ilvl w:val="0"/>
-          <w:numId w:val="1"/>
-        </w:numPr>
-        <w:ind w:left="142"/>
-        <w:rPr>
-          <w:b/>
-        </w:rPr>
-      </w:pPr>
-      <w:r>
-        <w:rPr>
-          <w:b/>
-        </w:rPr>
-        <w:t>CASAS Dataset</w:t>
-      </w:r>
-    </w:p>
-    <w:p>
-      <w:pPr>
-        <w:numPr>
-          <w:ilvl w:val="1"/>
-          <w:numId w:val="1"/>
-        </w:numPr>
-        <w:ind w:left="567"/>
-      </w:pPr>
-      <w:hyperlink r:id="rId8">
-        <w:r>
-          <w:rPr>
-            <w:color w:val="1155CC"/>
-            <w:u w:val="single"/>
-          </w:rPr>
-          <w:t>https://casas.wsu.edu/</w:t>
-        </w:r>
-      </w:hyperlink>
-    </w:p>
-    <w:p>
-      <w:pPr>
-        <w:numPr>
-          <w:ilvl w:val="1"/>
-          <w:numId w:val="1"/>
-        </w:numPr>
-        <w:ind w:left="567"/>
-      </w:pPr>
-      <w:r>
-        <w:t xml:space="preserve">The CASAS dataset includes </w:t>
-      </w:r>
-      <w:r>
-        <w:rPr>
-          <w:b/>
-        </w:rPr>
-        <w:t>seven smart homes</w:t>
-      </w:r>
-      <w:r>
-        <w:t xml:space="preserve"> selected for this study (includes motion sensor data &amp; house maps).</w:t>
-      </w:r>
-    </w:p>
-    <w:p>
-      <w:pPr>
-        <w:numPr>
-          <w:ilvl w:val="0"/>
-          <w:numId w:val="1"/>
-        </w:numPr>
-        <w:ind w:left="142"/>
-        <w:rPr>
-          <w:b/>
-        </w:rPr>
-      </w:pPr>
-      <w:r>
-        <w:rPr>
-          <w:b/>
-        </w:rPr>
-        <w:t>ORCATECH Dataset</w:t>
-      </w:r>
-    </w:p>
-    <w:p>
-      <w:pPr>
-        <w:numPr>
-          <w:ilvl w:val="1"/>
-          <w:numId w:val="1"/>
-        </w:numPr>
-        <w:ind w:left="567"/>
-      </w:pPr>
-      <w:hyperlink r:id="rId9">
         <w:r>
           <w:rPr>
             <w:color w:val="1155CC"/>
@@ -247,13 +46,114 @@
     <w:p>
       <w:pPr>
         <w:numPr>
+          <w:ilvl w:val="0"/>
+          <w:numId w:val="1"/>
+        </w:numPr>
+        <w:ind w:left="142"/>
+      </w:pPr>
+      <w:r>
+        <w:t>ORCATECH provided a comprehensive dataset, including:</w:t>
+      </w:r>
+    </w:p>
+    <w:p>
+      <w:pPr>
+        <w:numPr>
           <w:ilvl w:val="1"/>
           <w:numId w:val="1"/>
         </w:numPr>
         <w:ind w:left="567"/>
       </w:pPr>
       <w:r>
-        <w:t>ORCATECH provided a comprehensive dataset, including:</w:t>
+        <w:rPr>
+          <w:b/>
+        </w:rPr>
+        <w:t>Clinical assessment information</w:t>
+      </w:r>
+      <w:r>
+        <w:t xml:space="preserve"> (e.g., health status, cognitive evaluations):</w:t>
+      </w:r>
+      <w:r>
+        <w:rPr>
+          <w:rFonts w:eastAsia="Roboto Mono"/>
+          <w:b/>
+          <w:color w:val="188038"/>
+        </w:rPr>
+        <w:t xml:space="preserve"> Clinical Data &gt; clin_fin_red.xlsx</w:t>
+      </w:r>
+    </w:p>
+    <w:p>
+      <w:pPr>
+        <w:numPr>
+          <w:ilvl w:val="1"/>
+          <w:numId w:val="1"/>
+        </w:numPr>
+        <w:ind w:left="567"/>
+      </w:pPr>
+      <w:r>
+        <w:rPr>
+          <w:b/>
+        </w:rPr>
+        <w:t>Motion sensor data</w:t>
+      </w:r>
+    </w:p>
+    <w:p>
+      <w:pPr>
+        <w:numPr>
+          <w:ilvl w:val="1"/>
+          <w:numId w:val="1"/>
+        </w:numPr>
+        <w:ind w:left="567"/>
+      </w:pPr>
+      <w:r>
+        <w:rPr>
+          <w:b/>
+        </w:rPr>
+        <w:t>Survey responses</w:t>
+      </w:r>
+    </w:p>
+    <w:p>
+      <w:pPr>
+        <w:numPr>
+          <w:ilvl w:val="1"/>
+          <w:numId w:val="1"/>
+        </w:numPr>
+        <w:ind w:left="567"/>
+      </w:pPr>
+      <w:r>
+        <w:rPr>
+          <w:b/>
+        </w:rPr>
+        <w:t>Supplementary documents</w:t>
+      </w:r>
+    </w:p>
+    <w:p>
+      <w:pPr>
+        <w:numPr>
+          <w:ilvl w:val="0"/>
+          <w:numId w:val="1"/>
+        </w:numPr>
+        <w:ind w:left="142"/>
+      </w:pPr>
+      <w:r>
+        <w:rPr>
+          <w:b/>
+        </w:rPr>
+        <w:t>Key File Paths:</w:t>
+      </w:r>
+    </w:p>
+    <w:p>
+      <w:pPr>
+        <w:numPr>
+          <w:ilvl w:val="1"/>
+          <w:numId w:val="1"/>
+        </w:numPr>
+        <w:ind w:left="567"/>
+      </w:pPr>
+      <w:r>
+        <w:rPr>
+          <w:b/>
+        </w:rPr>
+        <w:t xml:space="preserve">Raw Sensor Data (Four studies – Miami, OHSU, Rush and VA): </w:t>
       </w:r>
     </w:p>
     <w:p>
@@ -263,23 +163,53 @@
           <w:numId w:val="1"/>
         </w:numPr>
         <w:ind w:left="1134"/>
-      </w:pPr>
-      <w:r>
-        <w:rPr>
-          <w:b/>
-        </w:rPr>
-        <w:t>Clinical assessment information</w:t>
-      </w:r>
-      <w:r>
-        <w:t xml:space="preserve"> (e.g., health status, cognitive evaluations):</w:t>
-      </w:r>
-      <w:r>
-        <w:rPr>
-          <w:rFonts w:ascii="Roboto Mono" w:eastAsia="Roboto Mono" w:hAnsi="Roboto Mono" w:cs="Roboto Mono"/>
-          <w:b/>
-          <w:color w:val="188038"/>
-        </w:rPr>
-        <w:t xml:space="preserve"> Clinical Data &gt; clin_fin_red.xlsx</w:t>
+        <w:rPr>
+          <w:color w:val="008000"/>
+        </w:rPr>
+      </w:pPr>
+      <w:r>
+        <w:t xml:space="preserve">Example Path for each participant: </w:t>
+      </w:r>
+      <w:r>
+        <w:br/>
+      </w:r>
+      <w:r>
+        <w:rPr>
+          <w:rFonts w:eastAsia="Roboto Mono"/>
+          <w:b/>
+          <w:color w:val="188038"/>
+        </w:rPr>
+        <w:t xml:space="preserve">Sensor Data &gt; OHSU &gt; </w:t>
+      </w:r>
+      <w:r>
+        <w:rPr>
+          <w:rFonts w:eastAsia="Roboto Mono"/>
+          <w:color w:val="188038"/>
+        </w:rPr>
+        <w:t>NYCE_Data_Pull_OHSU-CART_2024-02-20</w:t>
+      </w:r>
+      <w:r>
+        <w:rPr>
+          <w:rFonts w:eastAsia="Roboto Mono"/>
+          <w:color w:val="188038"/>
+        </w:rPr>
+        <w:t xml:space="preserve"> </w:t>
+      </w:r>
+      <w:r>
+        <w:rPr>
+          <w:rFonts w:eastAsia="Roboto Mono"/>
+          <w:color w:val="188038"/>
+        </w:rPr>
+        <w:br/>
+      </w:r>
+      <w:r>
+        <w:t xml:space="preserve">Example file: </w:t>
+      </w:r>
+      <w:r>
+        <w:rPr>
+          <w:color w:val="008000"/>
+        </w:rPr>
+        <w:t>NYCE_Area_Data_OHSU-CART_1111.csv</w:t>
       </w:r>
     </w:p>
     <w:p>
@@ -291,10 +221,22 @@
         <w:ind w:left="1134"/>
       </w:pPr>
       <w:r>
-        <w:rPr>
-          <w:b/>
-        </w:rPr>
-        <w:t>Motion sensor data</w:t>
+        <w:t>The NYCE motion sensor files contain a timestamped list of all the sensors in a home and when they detected presence/no presence.</w:t>
+      </w:r>
+    </w:p>
+    <w:p>
+      <w:pPr>
+        <w:numPr>
+          <w:ilvl w:val="1"/>
+          <w:numId w:val="1"/>
+        </w:numPr>
+        <w:ind w:left="567"/>
+      </w:pPr>
+      <w:r>
+        <w:rPr>
+          <w:b/>
+        </w:rPr>
+        <w:t xml:space="preserve">Data Dictionaries: </w:t>
       </w:r>
     </w:p>
     <w:p>
@@ -306,10 +248,119 @@
         <w:ind w:left="1134"/>
       </w:pPr>
       <w:r>
-        <w:rPr>
-          <w:b/>
-        </w:rPr>
-        <w:t>Survey responses</w:t>
+        <w:t xml:space="preserve">Path: </w:t>
+      </w:r>
+      <w:r>
+        <w:rPr>
+          <w:rFonts w:eastAsia="Roboto Mono"/>
+          <w:b/>
+          <w:color w:val="188038"/>
+        </w:rPr>
+        <w:t xml:space="preserve">Supplementary Documents &gt; </w:t>
+      </w:r>
+      <w:proofErr w:type="spellStart"/>
+      <w:r>
+        <w:rPr>
+          <w:rFonts w:eastAsia="Roboto Mono"/>
+          <w:b/>
+          <w:color w:val="188038"/>
+        </w:rPr>
+        <w:t>Sensor_Data_Dictionaries</w:t>
+      </w:r>
+      <w:proofErr w:type="spellEnd"/>
+      <w:r>
+        <w:rPr>
+          <w:rFonts w:eastAsia="Roboto Mono"/>
+          <w:b/>
+          <w:color w:val="188038"/>
+        </w:rPr>
+        <w:t xml:space="preserve"> </w:t>
+      </w:r>
+      <w:r>
+        <w:rPr>
+          <w:rFonts w:eastAsia="Roboto Mono"/>
+          <w:b/>
+          <w:color w:val="188038"/>
+        </w:rPr>
+        <w:br/>
+      </w:r>
+      <w:r>
+        <w:t xml:space="preserve">Example file: </w:t>
+      </w:r>
+      <w:r>
+        <w:rPr>
+          <w:rFonts w:eastAsia="Roboto Mono"/>
+          <w:color w:val="188038"/>
+        </w:rPr>
+        <w:t>NYCE_DataDictionary_2023-09-11.xlsx</w:t>
+      </w:r>
+      <w:r>
+        <w:t xml:space="preserve"> — describes the sensor data files.</w:t>
+      </w:r>
+      <w:r>
+        <w:br/>
+      </w:r>
+      <w:r>
+        <w:rPr>
+          <w:rFonts w:eastAsia="Roboto Mono"/>
+          <w:b/>
+          <w:color w:val="188038"/>
+        </w:rPr>
+        <w:br/>
+      </w:r>
+      <w:r>
+        <w:rPr>
+          <w:noProof/>
+        </w:rPr>
+        <w:drawing>
+          <wp:inline distT="0" distB="0" distL="0" distR="0" wp14:anchorId="7D90AC1C" wp14:editId="5EDDB548">
+            <wp:extent cx="4112335" cy="4459857"/>
+            <wp:effectExtent l="0" t="0" r="2540" b="0"/>
+            <wp:docPr id="1970591903" name="Picture 1"/>
+            <wp:cNvGraphicFramePr>
+              <a:graphicFrameLocks xmlns:a="http://schemas.openxmlformats.org/drawingml/2006/main" noChangeAspect="1"/>
+            </wp:cNvGraphicFramePr>
+            <a:graphic xmlns:a="http://schemas.openxmlformats.org/drawingml/2006/main">
+              <a:graphicData uri="http://schemas.openxmlformats.org/drawingml/2006/picture">
+                <pic:pic xmlns:pic="http://schemas.openxmlformats.org/drawingml/2006/picture">
+                  <pic:nvPicPr>
+                    <pic:cNvPr id="1970591903" name="Picture 1970591903"/>
+                    <pic:cNvPicPr/>
+                  </pic:nvPicPr>
+                  <pic:blipFill>
+                    <a:blip r:embed="rId8">
+                      <a:extLst>
+                        <a:ext uri="{28A0092B-C50C-407E-A947-70E740481C1C}">
+                          <a14:useLocalDpi xmlns:a14="http://schemas.microsoft.com/office/drawing/2010/main" val="0"/>
+                        </a:ext>
+                      </a:extLst>
+                    </a:blip>
+                    <a:stretch>
+                      <a:fillRect/>
+                    </a:stretch>
+                  </pic:blipFill>
+                  <pic:spPr>
+                    <a:xfrm>
+                      <a:off x="0" y="0"/>
+                      <a:ext cx="4114891" cy="4462629"/>
+                    </a:xfrm>
+                    <a:prstGeom prst="rect">
+                      <a:avLst/>
+                    </a:prstGeom>
+                  </pic:spPr>
+                </pic:pic>
+              </a:graphicData>
+            </a:graphic>
+          </wp:inline>
+        </w:drawing>
+      </w:r>
+    </w:p>
+    <w:p>
+      <w:pPr>
+        <w:ind w:left="1560"/>
+      </w:pPr>
+      <w:r>
+        <w:t xml:space="preserve">. </w:t>
       </w:r>
     </w:p>
     <w:p>
@@ -319,12 +370,66 @@
           <w:numId w:val="1"/>
         </w:numPr>
         <w:ind w:left="1134"/>
-      </w:pPr>
-      <w:r>
-        <w:rPr>
-          <w:b/>
-        </w:rPr>
-        <w:t>Supplementary documents</w:t>
+        <w:rPr>
+          <w:bCs/>
+        </w:rPr>
+      </w:pPr>
+      <w:r>
+        <w:t xml:space="preserve">Some sensor streams (e.g., wearable, electronic pillbox) are associated with individual subject IDs, other sensors (e.g., NYCE motion/contact, scale) are </w:t>
+      </w:r>
+      <w:r>
+        <w:lastRenderedPageBreak/>
+        <w:t xml:space="preserve">associated with a home ID. The data dictionaries for each sensor stream all detail which columns indicate subject </w:t>
+      </w:r>
+      <w:proofErr w:type="gramStart"/>
+      <w:r>
+        <w:t>IDs</w:t>
+      </w:r>
+      <w:proofErr w:type="gramEnd"/>
+      <w:r>
+        <w:t xml:space="preserve"> and which indicate home IDs. A mapping of which subject IDs were associated with which home IDs </w:t>
+      </w:r>
+      <w:proofErr w:type="gramStart"/>
+      <w:r>
+        <w:t>during the course of</w:t>
+      </w:r>
+      <w:proofErr w:type="gramEnd"/>
+      <w:r>
+        <w:t xml:space="preserve"> the study at: </w:t>
+      </w:r>
+      <w:r>
+        <w:br/>
+      </w:r>
+      <w:r>
+        <w:rPr>
+          <w:rFonts w:eastAsia="Roboto Mono"/>
+          <w:b/>
+          <w:color w:val="188038"/>
+        </w:rPr>
+        <w:t>Supplementary Documents\_CONTEXT_FILES\Study_Home-Subject_Dates_2024-03-03</w:t>
+      </w:r>
+      <w:r>
+        <w:rPr>
+          <w:rFonts w:eastAsia="Roboto Mono"/>
+          <w:b/>
+          <w:color w:val="188038"/>
+        </w:rPr>
+        <w:br/>
+      </w:r>
+      <w:r>
+        <w:rPr>
+          <w:rFonts w:eastAsia="Roboto Mono"/>
+          <w:bCs/>
+        </w:rPr>
+        <w:t>Example file:</w:t>
+      </w:r>
+      <w:r>
+        <w:rPr>
+          <w:rFonts w:eastAsia="Roboto Mono"/>
+          <w:bCs/>
+          <w:color w:val="188038"/>
+        </w:rPr>
+        <w:t xml:space="preserve"> OHSU-CART_Home-Subject_Dates_Through_2024-03-03.csv</w:t>
       </w:r>
     </w:p>
     <w:p>
@@ -339,7 +444,7 @@
         <w:rPr>
           <w:b/>
         </w:rPr>
-        <w:t>Key File Paths:</w:t>
+        <w:t>Room Adjacency Files:</w:t>
       </w:r>
     </w:p>
     <w:p>
@@ -351,10 +456,19 @@
         <w:ind w:left="1134"/>
       </w:pPr>
       <w:r>
-        <w:rPr>
-          <w:b/>
-        </w:rPr>
-        <w:t xml:space="preserve">Raw Sensor Data (Four studies – Miami, OHSU, Rush and VA): </w:t>
+        <w:t>They do not have house maps, but they do record which rooms in a home are adjacent to each other.</w:t>
+      </w:r>
+    </w:p>
+    <w:p>
+      <w:pPr>
+        <w:numPr>
+          <w:ilvl w:val="2"/>
+          <w:numId w:val="1"/>
+        </w:numPr>
+        <w:ind w:left="1134"/>
+      </w:pPr>
+      <w:r>
+        <w:t xml:space="preserve">Path: </w:t>
       </w:r>
     </w:p>
     <w:p>
@@ -366,26 +480,23 @@
         <w:ind w:left="1560"/>
       </w:pPr>
       <w:r>
-        <w:t xml:space="preserve">Example Path for each participant: </w:t>
-      </w:r>
-      <w:r>
-        <w:br/>
-      </w:r>
-      <w:r>
-        <w:rPr>
-          <w:rFonts w:ascii="Roboto Mono" w:eastAsia="Roboto Mono" w:hAnsi="Roboto Mono" w:cs="Roboto Mono"/>
-          <w:b/>
-          <w:color w:val="188038"/>
-        </w:rPr>
-        <w:t xml:space="preserve">Sensor Data &gt; OHSU &gt; </w:t>
-      </w:r>
-      <w:r>
-        <w:rPr>
-          <w:rFonts w:ascii="Roboto Mono" w:eastAsia="Roboto Mono" w:hAnsi="Roboto Mono" w:cs="Roboto Mono"/>
-          <w:color w:val="188038"/>
-        </w:rPr>
-        <w:t>NYCE_Data_Pull_OHSU-CART_2024-02-20</w:t>
-      </w:r>
+        <w:rPr>
+          <w:rFonts w:eastAsia="Roboto Mono"/>
+          <w:b/>
+          <w:color w:val="188038"/>
+        </w:rPr>
+        <w:t xml:space="preserve">Supplementary Documents &gt; _CONTEXT_FILES &gt; </w:t>
+      </w:r>
+      <w:proofErr w:type="spellStart"/>
+      <w:r>
+        <w:rPr>
+          <w:rFonts w:eastAsia="Roboto Mono"/>
+          <w:b/>
+          <w:color w:val="188038"/>
+        </w:rPr>
+        <w:t>NYCE_Adjacency</w:t>
+      </w:r>
+      <w:proofErr w:type="spellEnd"/>
     </w:p>
     <w:p>
       <w:pPr>
@@ -396,23 +507,66 @@
         <w:ind w:left="1560"/>
       </w:pPr>
       <w:r>
-        <w:t>The NYCE motion sensor files contain a timestamped list of all the sensors in a home and when they detected presence/no presence.</w:t>
-      </w:r>
-    </w:p>
-    <w:p>
-      <w:pPr>
-        <w:numPr>
-          <w:ilvl w:val="2"/>
-          <w:numId w:val="1"/>
-        </w:numPr>
-        <w:ind w:left="1134"/>
-      </w:pPr>
-      <w:r>
-        <w:rPr>
-          <w:b/>
-        </w:rPr>
-        <w:t xml:space="preserve">Data Dictionaries: </w:t>
-      </w:r>
+        <w:t>The data dictionary</w:t>
+      </w:r>
+      <w:r>
+        <w:rPr>
+          <w:rFonts w:eastAsia="Roboto Mono"/>
+          <w:color w:val="188038"/>
+        </w:rPr>
+        <w:t xml:space="preserve"> </w:t>
+      </w:r>
+      <w:r>
+        <w:t>for these files</w:t>
+      </w:r>
+      <w:r>
+        <w:rPr>
+          <w:rFonts w:eastAsia="Roboto Mono"/>
+          <w:color w:val="188038"/>
+        </w:rPr>
+        <w:t xml:space="preserve"> </w:t>
+      </w:r>
+      <w:r>
+        <w:rPr>
+          <w:rFonts w:eastAsia="Roboto Mono"/>
+          <w:color w:val="188038"/>
+        </w:rPr>
+        <w:t>(NYCE_Adjacency_DataDictionary_2023-12-29.xlsx</w:t>
+      </w:r>
+      <w:r>
+        <w:rPr>
+          <w:rFonts w:eastAsia="Roboto Mono"/>
+          <w:color w:val="188038"/>
+        </w:rPr>
+        <w:t>)</w:t>
+      </w:r>
+      <w:r>
+        <w:br/>
+      </w:r>
+      <w:r>
+        <w:t xml:space="preserve">is also stored at: </w:t>
+      </w:r>
+      <w:r>
+        <w:br/>
+      </w:r>
+      <w:r>
+        <w:rPr>
+          <w:rFonts w:eastAsia="Roboto Mono"/>
+          <w:b/>
+          <w:color w:val="188038"/>
+        </w:rPr>
+        <w:t xml:space="preserve">Supplementary Documents &gt; </w:t>
+      </w:r>
+      <w:proofErr w:type="spellStart"/>
+      <w:r>
+        <w:rPr>
+          <w:rFonts w:eastAsia="Roboto Mono"/>
+          <w:b/>
+          <w:color w:val="188038"/>
+        </w:rPr>
+        <w:t>Sensor_Data_Dictionaries</w:t>
+      </w:r>
+      <w:proofErr w:type="spellEnd"/>
     </w:p>
     <w:p>
       <w:pPr>
@@ -420,216 +574,51 @@
           <w:ilvl w:val="3"/>
           <w:numId w:val="1"/>
         </w:numPr>
+        <w:spacing w:after="240"/>
         <w:ind w:left="1560"/>
-      </w:pPr>
-      <w:r>
-        <w:t xml:space="preserve">Path: </w:t>
-      </w:r>
-      <w:r>
-        <w:rPr>
-          <w:rFonts w:ascii="Roboto Mono" w:eastAsia="Roboto Mono" w:hAnsi="Roboto Mono" w:cs="Roboto Mono"/>
-          <w:b/>
-          <w:color w:val="188038"/>
-        </w:rPr>
-        <w:t xml:space="preserve">Supplementary Documents &gt; Sensor_Data_Dictionaries </w:t>
-      </w:r>
-    </w:p>
-    <w:p>
-      <w:pPr>
-        <w:ind w:left="1560"/>
-      </w:pPr>
-      <w:r>
-        <w:t xml:space="preserve">Example Files: </w:t>
-      </w:r>
-      <w:r>
-        <w:rPr>
-          <w:rFonts w:ascii="Roboto Mono" w:eastAsia="Roboto Mono" w:hAnsi="Roboto Mono" w:cs="Roboto Mono"/>
-          <w:color w:val="188038"/>
-        </w:rPr>
-        <w:t>NYCE_DataDictionary_2023-09-11.xlsx</w:t>
-      </w:r>
-      <w:r>
-        <w:t xml:space="preserve"> — describes the sensor data files. </w:t>
-      </w:r>
-    </w:p>
-    <w:p>
-      <w:pPr>
-        <w:numPr>
-          <w:ilvl w:val="3"/>
-          <w:numId w:val="1"/>
-        </w:numPr>
-        <w:ind w:left="1560"/>
-      </w:pPr>
-      <w:r>
-        <w:t xml:space="preserve">Some sensor streams (e.g., wearable, electronic pillbox) are associated with individual subject IDs, other sensors (e.g., NYCE motion/contact, scale) are associated with a home ID. The data dictionaries for each sensor stream all detail which columns indicate subject IDs and which indicate home IDs. A mapping of which subject IDs were associated with which home IDs during the course of the study at: </w:t>
+        <w:rPr>
+          <w:bCs/>
+        </w:rPr>
+      </w:pPr>
+      <w:r>
+        <w:t>A file that maps the “</w:t>
+      </w:r>
+      <w:proofErr w:type="spellStart"/>
+      <w:r>
+        <w:rPr>
+          <w:b/>
+        </w:rPr>
+        <w:t>areaid</w:t>
+      </w:r>
+      <w:proofErr w:type="spellEnd"/>
+      <w:r>
+        <w:t xml:space="preserve">” numerical value to a string that identifies the corresponding room in the home: </w:t>
       </w:r>
       <w:r>
         <w:br/>
       </w:r>
       <w:r>
         <w:rPr>
-          <w:rFonts w:ascii="Roboto Mono" w:eastAsia="Roboto Mono" w:hAnsi="Roboto Mono" w:cs="Roboto Mono"/>
-          <w:b/>
-          <w:color w:val="188038"/>
-        </w:rPr>
-        <w:t>Supplementary Documents\_CONTEXT_FILES\Study_Home-Subject_Dates_2024-03-03</w:t>
-      </w:r>
-    </w:p>
-    <w:p>
-      <w:pPr>
-        <w:numPr>
-          <w:ilvl w:val="2"/>
-          <w:numId w:val="1"/>
-        </w:numPr>
-        <w:ind w:left="1134"/>
-      </w:pPr>
-      <w:r>
-        <w:rPr>
-          <w:b/>
-        </w:rPr>
-        <w:t>Room Adjacency Files:</w:t>
-      </w:r>
-    </w:p>
-    <w:p>
-      <w:pPr>
-        <w:numPr>
-          <w:ilvl w:val="3"/>
-          <w:numId w:val="1"/>
-        </w:numPr>
-        <w:ind w:left="1560"/>
-      </w:pPr>
-      <w:r>
-        <w:t>They do not have house maps, but they do record which rooms in a home are adjacent to each other.</w:t>
-      </w:r>
-    </w:p>
-    <w:p>
-      <w:pPr>
-        <w:numPr>
-          <w:ilvl w:val="3"/>
-          <w:numId w:val="1"/>
-        </w:numPr>
-        <w:ind w:left="1560"/>
-      </w:pPr>
-      <w:r>
-        <w:t xml:space="preserve">Path: </w:t>
-      </w:r>
-    </w:p>
-    <w:p>
-      <w:pPr>
-        <w:numPr>
-          <w:ilvl w:val="4"/>
-          <w:numId w:val="1"/>
-        </w:numPr>
-        <w:ind w:left="2127" w:hanging="425"/>
-      </w:pPr>
-      <w:r>
-        <w:rPr>
-          <w:rFonts w:ascii="Roboto Mono" w:eastAsia="Roboto Mono" w:hAnsi="Roboto Mono" w:cs="Roboto Mono"/>
-          <w:b/>
-          <w:color w:val="188038"/>
-        </w:rPr>
-        <w:t>Supplementary Documents &gt; _CONTEXT_FILES &gt; NYCE_Adjacency</w:t>
-      </w:r>
-    </w:p>
-    <w:p>
-      <w:pPr>
-        <w:numPr>
-          <w:ilvl w:val="4"/>
-          <w:numId w:val="1"/>
-        </w:numPr>
-        <w:ind w:left="2127" w:hanging="425"/>
-      </w:pPr>
-      <w:r>
-        <w:lastRenderedPageBreak/>
-        <w:t>The data dictionary</w:t>
-      </w:r>
-      <w:r>
-        <w:rPr>
-          <w:rFonts w:ascii="Roboto Mono" w:eastAsia="Roboto Mono" w:hAnsi="Roboto Mono" w:cs="Roboto Mono"/>
-          <w:color w:val="188038"/>
-        </w:rPr>
-        <w:t xml:space="preserve"> </w:t>
-      </w:r>
-      <w:r>
-        <w:t>for these files</w:t>
-      </w:r>
-      <w:r>
-        <w:rPr>
-          <w:rFonts w:ascii="Roboto Mono" w:eastAsia="Roboto Mono" w:hAnsi="Roboto Mono" w:cs="Roboto Mono"/>
-          <w:color w:val="188038"/>
-        </w:rPr>
-        <w:t xml:space="preserve"> </w:t>
-      </w:r>
-      <w:r>
-        <w:rPr>
-          <w:rFonts w:ascii="Roboto Mono" w:eastAsia="Roboto Mono" w:hAnsi="Roboto Mono" w:cs="Roboto Mono"/>
-          <w:color w:val="188038"/>
-        </w:rPr>
-        <w:t>(NYCE_Adjacency_DataDictionary_2023-12-29.xlsx</w:t>
-      </w:r>
-      <w:r>
-        <w:rPr>
-          <w:rFonts w:ascii="Roboto Mono" w:eastAsia="Roboto Mono" w:hAnsi="Roboto Mono" w:cs="Roboto Mono"/>
-          <w:color w:val="188038"/>
-        </w:rPr>
-        <w:t>)</w:t>
-      </w:r>
-      <w:r>
-        <w:br/>
-      </w:r>
-      <w:r>
-        <w:t xml:space="preserve">is also stored at: </w:t>
-      </w:r>
-      <w:r>
-        <w:br/>
-      </w:r>
-      <w:r>
-        <w:rPr>
-          <w:rFonts w:ascii="Roboto Mono" w:eastAsia="Roboto Mono" w:hAnsi="Roboto Mono" w:cs="Roboto Mono"/>
-          <w:b/>
-          <w:color w:val="188038"/>
-        </w:rPr>
-        <w:t>Supplementary Documents &gt; Sensor_Data_Dictionaries</w:t>
-      </w:r>
-    </w:p>
-    <w:p>
-      <w:pPr>
-        <w:numPr>
-          <w:ilvl w:val="4"/>
-          <w:numId w:val="1"/>
-        </w:numPr>
-        <w:spacing w:after="240"/>
-        <w:ind w:left="2127" w:hanging="425"/>
-      </w:pPr>
-      <w:r>
-        <w:t>A file that maps the “</w:t>
-      </w:r>
-      <w:r>
-        <w:rPr>
-          <w:b/>
-        </w:rPr>
-        <w:t>areaid</w:t>
-      </w:r>
-      <w:r>
-        <w:t xml:space="preserve">” numerical value to a string that identifies the corresponding room in the home: </w:t>
-      </w:r>
-      <w:r>
-        <w:br/>
-      </w:r>
-      <w:r>
-        <w:rPr>
-          <w:rFonts w:ascii="Roboto Mono" w:eastAsia="Roboto Mono" w:hAnsi="Roboto Mono" w:cs="Roboto Mono"/>
-          <w:b/>
-          <w:color w:val="188038"/>
-        </w:rPr>
-        <w:t>Supplementary Documents &gt; _CONTEXT_FILES &gt; area_dictionary.xlsx</w:t>
+          <w:rFonts w:eastAsia="Roboto Mono"/>
+          <w:b/>
+          <w:color w:val="188038"/>
+        </w:rPr>
+        <w:t xml:space="preserve">Supplementary Documents &gt; _CONTEXT_FILES &gt; </w:t>
+      </w:r>
+      <w:r>
+        <w:rPr>
+          <w:rFonts w:eastAsia="Roboto Mono"/>
+          <w:bCs/>
+          <w:color w:val="188038"/>
+        </w:rPr>
+        <w:t>area_dictionary.xlsx</w:t>
       </w:r>
     </w:p>
     <w:p>
       <w:pPr>
         <w:spacing w:before="240" w:after="240"/>
         <w:rPr>
-          <w:rFonts w:ascii="Roboto Mono" w:eastAsia="Roboto Mono" w:hAnsi="Roboto Mono" w:cs="Roboto Mono"/>
+          <w:rFonts w:eastAsia="Roboto Mono"/>
           <w:b/>
           <w:color w:val="188038"/>
         </w:rPr>
@@ -638,7 +627,7 @@
     <w:p/>
     <w:p/>
     <w:sectPr>
-      <w:footerReference w:type="default" r:id="rId10"/>
+      <w:footerReference w:type="default" r:id="rId9"/>
       <w:pgSz w:w="11909" w:h="16834"/>
       <w:pgMar w:top="1361" w:right="1361" w:bottom="1361" w:left="1361" w:header="720" w:footer="720" w:gutter="0"/>
       <w:pgNumType w:start="1"/>

</xml_diff>